<commit_message>
Recap Fill: EFT after a letter doesn't count, and two plain stops
EFT counts only with no letter right before it, so Left recap and Theft
log are left out, while IN EFT recap, eft_recap and 2026EFT recap still
count. When every Word file with EFT in its name ends in a date, like
the copies Fill saves, Fill says so and names them. And Fill only works
in a folder that holds the workbook itself, so on OneDrive it never
reads or saves in a folder that only has the same name.
</commit_message>
<xml_diff>
--- a/General/Recap fill/EFT recap.docx
+++ b/General/Recap fill/EFT recap.docx
@@ -651,7 +651,7 @@
     <w:link w:val="Heading1Char"/>
     <w:uiPriority w:val="9"/>
     <w:qFormat/>
-    <w:rsid w:val="00154EA8"/>
+    <w:rsid w:val="00E81389"/>
     <w:pPr>
       <w:keepNext/>
       <w:keepLines/>
@@ -674,7 +674,7 @@
     <w:semiHidden/>
     <w:unhideWhenUsed/>
     <w:qFormat/>
-    <w:rsid w:val="00154EA8"/>
+    <w:rsid w:val="00E81389"/>
     <w:pPr>
       <w:keepNext/>
       <w:keepLines/>
@@ -697,7 +697,7 @@
     <w:semiHidden/>
     <w:unhideWhenUsed/>
     <w:qFormat/>
-    <w:rsid w:val="00154EA8"/>
+    <w:rsid w:val="00E81389"/>
     <w:pPr>
       <w:keepNext/>
       <w:keepLines/>
@@ -720,7 +720,7 @@
     <w:semiHidden/>
     <w:unhideWhenUsed/>
     <w:qFormat/>
-    <w:rsid w:val="00154EA8"/>
+    <w:rsid w:val="00E81389"/>
     <w:pPr>
       <w:keepNext/>
       <w:keepLines/>
@@ -743,7 +743,7 @@
     <w:semiHidden/>
     <w:unhideWhenUsed/>
     <w:qFormat/>
-    <w:rsid w:val="00154EA8"/>
+    <w:rsid w:val="00E81389"/>
     <w:pPr>
       <w:keepNext/>
       <w:keepLines/>
@@ -764,7 +764,7 @@
     <w:semiHidden/>
     <w:unhideWhenUsed/>
     <w:qFormat/>
-    <w:rsid w:val="00154EA8"/>
+    <w:rsid w:val="00E81389"/>
     <w:pPr>
       <w:keepNext/>
       <w:keepLines/>
@@ -787,7 +787,7 @@
     <w:semiHidden/>
     <w:unhideWhenUsed/>
     <w:qFormat/>
-    <w:rsid w:val="00154EA8"/>
+    <w:rsid w:val="00E81389"/>
     <w:pPr>
       <w:keepNext/>
       <w:keepLines/>
@@ -808,7 +808,7 @@
     <w:semiHidden/>
     <w:unhideWhenUsed/>
     <w:qFormat/>
-    <w:rsid w:val="00154EA8"/>
+    <w:rsid w:val="00E81389"/>
     <w:pPr>
       <w:keepNext/>
       <w:keepLines/>
@@ -831,7 +831,7 @@
     <w:semiHidden/>
     <w:unhideWhenUsed/>
     <w:qFormat/>
-    <w:rsid w:val="00154EA8"/>
+    <w:rsid w:val="00E81389"/>
     <w:pPr>
       <w:keepNext/>
       <w:keepLines/>
@@ -875,7 +875,7 @@
     <w:basedOn w:val="DefaultParagraphFont"/>
     <w:link w:val="Heading1"/>
     <w:uiPriority w:val="9"/>
-    <w:rsid w:val="00154EA8"/>
+    <w:rsid w:val="00E81389"/>
     <w:rPr>
       <w:rFonts w:asciiTheme="majorHAnsi" w:eastAsiaTheme="majorEastAsia" w:hAnsiTheme="majorHAnsi" w:cstheme="majorBidi"/>
       <w:color w:val="0F4761" w:themeColor="accent1" w:themeShade="BF"/>
@@ -889,7 +889,7 @@
     <w:link w:val="Heading2"/>
     <w:uiPriority w:val="9"/>
     <w:semiHidden/>
-    <w:rsid w:val="00154EA8"/>
+    <w:rsid w:val="00E81389"/>
     <w:rPr>
       <w:rFonts w:asciiTheme="majorHAnsi" w:eastAsiaTheme="majorEastAsia" w:hAnsiTheme="majorHAnsi" w:cstheme="majorBidi"/>
       <w:color w:val="0F4761" w:themeColor="accent1" w:themeShade="BF"/>
@@ -903,7 +903,7 @@
     <w:link w:val="Heading3"/>
     <w:uiPriority w:val="9"/>
     <w:semiHidden/>
-    <w:rsid w:val="00154EA8"/>
+    <w:rsid w:val="00E81389"/>
     <w:rPr>
       <w:rFonts w:eastAsiaTheme="majorEastAsia" w:cstheme="majorBidi"/>
       <w:color w:val="0F4761" w:themeColor="accent1" w:themeShade="BF"/>
@@ -917,7 +917,7 @@
     <w:link w:val="Heading4"/>
     <w:uiPriority w:val="9"/>
     <w:semiHidden/>
-    <w:rsid w:val="00154EA8"/>
+    <w:rsid w:val="00E81389"/>
     <w:rPr>
       <w:rFonts w:eastAsiaTheme="majorEastAsia" w:cstheme="majorBidi"/>
       <w:i/>
@@ -931,7 +931,7 @@
     <w:link w:val="Heading5"/>
     <w:uiPriority w:val="9"/>
     <w:semiHidden/>
-    <w:rsid w:val="00154EA8"/>
+    <w:rsid w:val="00E81389"/>
     <w:rPr>
       <w:rFonts w:eastAsiaTheme="majorEastAsia" w:cstheme="majorBidi"/>
       <w:color w:val="0F4761" w:themeColor="accent1" w:themeShade="BF"/>
@@ -943,7 +943,7 @@
     <w:link w:val="Heading6"/>
     <w:uiPriority w:val="9"/>
     <w:semiHidden/>
-    <w:rsid w:val="00154EA8"/>
+    <w:rsid w:val="00E81389"/>
     <w:rPr>
       <w:rFonts w:eastAsiaTheme="majorEastAsia" w:cstheme="majorBidi"/>
       <w:i/>
@@ -957,7 +957,7 @@
     <w:link w:val="Heading7"/>
     <w:uiPriority w:val="9"/>
     <w:semiHidden/>
-    <w:rsid w:val="00154EA8"/>
+    <w:rsid w:val="00E81389"/>
     <w:rPr>
       <w:rFonts w:eastAsiaTheme="majorEastAsia" w:cstheme="majorBidi"/>
       <w:color w:val="595959" w:themeColor="text1" w:themeTint="A6"/>
@@ -969,7 +969,7 @@
     <w:link w:val="Heading8"/>
     <w:uiPriority w:val="9"/>
     <w:semiHidden/>
-    <w:rsid w:val="00154EA8"/>
+    <w:rsid w:val="00E81389"/>
     <w:rPr>
       <w:rFonts w:eastAsiaTheme="majorEastAsia" w:cstheme="majorBidi"/>
       <w:i/>
@@ -983,7 +983,7 @@
     <w:link w:val="Heading9"/>
     <w:uiPriority w:val="9"/>
     <w:semiHidden/>
-    <w:rsid w:val="00154EA8"/>
+    <w:rsid w:val="00E81389"/>
     <w:rPr>
       <w:rFonts w:eastAsiaTheme="majorEastAsia" w:cstheme="majorBidi"/>
       <w:color w:val="272727" w:themeColor="text1" w:themeTint="D8"/>
@@ -996,7 +996,7 @@
     <w:link w:val="TitleChar"/>
     <w:uiPriority w:val="10"/>
     <w:qFormat/>
-    <w:rsid w:val="00154EA8"/>
+    <w:rsid w:val="00E81389"/>
     <w:pPr>
       <w:spacing w:after="80" w:line="240" w:lineRule="auto"/>
       <w:contextualSpacing/>
@@ -1014,7 +1014,7 @@
     <w:basedOn w:val="DefaultParagraphFont"/>
     <w:link w:val="Title"/>
     <w:uiPriority w:val="10"/>
-    <w:rsid w:val="00154EA8"/>
+    <w:rsid w:val="00E81389"/>
     <w:rPr>
       <w:rFonts w:asciiTheme="majorHAnsi" w:eastAsiaTheme="majorEastAsia" w:hAnsiTheme="majorHAnsi" w:cstheme="majorBidi"/>
       <w:spacing w:val="-10"/>
@@ -1030,7 +1030,7 @@
     <w:link w:val="SubtitleChar"/>
     <w:uiPriority w:val="11"/>
     <w:qFormat/>
-    <w:rsid w:val="00154EA8"/>
+    <w:rsid w:val="00E81389"/>
     <w:pPr>
       <w:numPr>
         <w:ilvl w:val="1"/>
@@ -1049,7 +1049,7 @@
     <w:basedOn w:val="DefaultParagraphFont"/>
     <w:link w:val="Subtitle"/>
     <w:uiPriority w:val="11"/>
-    <w:rsid w:val="00154EA8"/>
+    <w:rsid w:val="00E81389"/>
     <w:rPr>
       <w:rFonts w:eastAsiaTheme="majorEastAsia" w:cstheme="majorBidi"/>
       <w:color w:val="595959" w:themeColor="text1" w:themeTint="A6"/>
@@ -1065,7 +1065,7 @@
     <w:link w:val="QuoteChar"/>
     <w:uiPriority w:val="29"/>
     <w:qFormat/>
-    <w:rsid w:val="00154EA8"/>
+    <w:rsid w:val="00E81389"/>
     <w:pPr>
       <w:spacing w:before="160"/>
       <w:jc w:val="center"/>
@@ -1081,7 +1081,7 @@
     <w:basedOn w:val="DefaultParagraphFont"/>
     <w:link w:val="Quote"/>
     <w:uiPriority w:val="29"/>
-    <w:rsid w:val="00154EA8"/>
+    <w:rsid w:val="00E81389"/>
     <w:rPr>
       <w:i/>
       <w:iCs/>
@@ -1093,7 +1093,7 @@
     <w:basedOn w:val="Normal"/>
     <w:uiPriority w:val="34"/>
     <w:qFormat/>
-    <w:rsid w:val="00154EA8"/>
+    <w:rsid w:val="00E81389"/>
     <w:pPr>
       <w:ind w:left="720"/>
       <w:contextualSpacing/>
@@ -1104,7 +1104,7 @@
     <w:basedOn w:val="DefaultParagraphFont"/>
     <w:uiPriority w:val="21"/>
     <w:qFormat/>
-    <w:rsid w:val="00154EA8"/>
+    <w:rsid w:val="00E81389"/>
     <w:rPr>
       <w:i/>
       <w:iCs/>
@@ -1118,7 +1118,7 @@
     <w:link w:val="IntenseQuoteChar"/>
     <w:uiPriority w:val="30"/>
     <w:qFormat/>
-    <w:rsid w:val="00154EA8"/>
+    <w:rsid w:val="00E81389"/>
     <w:pPr>
       <w:pBdr>
         <w:top w:val="single" w:sz="4" w:space="10" w:color="0F4761" w:themeColor="accent1" w:themeShade="BF"/>
@@ -1139,7 +1139,7 @@
     <w:basedOn w:val="DefaultParagraphFont"/>
     <w:link w:val="IntenseQuote"/>
     <w:uiPriority w:val="30"/>
-    <w:rsid w:val="00154EA8"/>
+    <w:rsid w:val="00E81389"/>
     <w:rPr>
       <w:i/>
       <w:iCs/>
@@ -1151,7 +1151,7 @@
     <w:basedOn w:val="DefaultParagraphFont"/>
     <w:uiPriority w:val="32"/>
     <w:qFormat/>
-    <w:rsid w:val="00154EA8"/>
+    <w:rsid w:val="00E81389"/>
     <w:rPr>
       <w:b/>
       <w:bCs/>
@@ -1166,7 +1166,7 @@
     <w:link w:val="HeaderChar"/>
     <w:uiPriority w:val="99"/>
     <w:unhideWhenUsed/>
-    <w:rsid w:val="00154EA8"/>
+    <w:rsid w:val="00E81389"/>
     <w:pPr>
       <w:tabs>
         <w:tab w:val="center" w:pos="4680"/>
@@ -1180,7 +1180,7 @@
     <w:basedOn w:val="DefaultParagraphFont"/>
     <w:link w:val="Header"/>
     <w:uiPriority w:val="99"/>
-    <w:rsid w:val="00154EA8"/>
+    <w:rsid w:val="00E81389"/>
   </w:style>
   <w:style w:type="paragraph" w:styleId="Footer">
     <w:name w:val="footer"/>
@@ -1188,7 +1188,7 @@
     <w:link w:val="FooterChar"/>
     <w:uiPriority w:val="99"/>
     <w:unhideWhenUsed/>
-    <w:rsid w:val="00154EA8"/>
+    <w:rsid w:val="00E81389"/>
     <w:pPr>
       <w:tabs>
         <w:tab w:val="center" w:pos="4680"/>
@@ -1202,7 +1202,7 @@
     <w:basedOn w:val="DefaultParagraphFont"/>
     <w:link w:val="Footer"/>
     <w:uiPriority w:val="99"/>
-    <w:rsid w:val="00154EA8"/>
+    <w:rsid w:val="00E81389"/>
   </w:style>
 </w:styles>
 </file>

</xml_diff>

<commit_message>
Recap Fill: the line to type an exact name comes before the dated copies
When every Word file with EFT in its name is a dated copy, the box now
says to type the exact name before it lists them, as the other two boxes
do. A folder with dozens of dated copies fills the box, and the end of
the list is what gets cut off, not that line.
</commit_message>
<xml_diff>
--- a/General/Recap fill/EFT recap.docx
+++ b/General/Recap fill/EFT recap.docx
@@ -651,7 +651,7 @@
     <w:link w:val="Heading1Char"/>
     <w:uiPriority w:val="9"/>
     <w:qFormat/>
-    <w:rsid w:val="00E81389"/>
+    <w:rsid w:val="00F30A11"/>
     <w:pPr>
       <w:keepNext/>
       <w:keepLines/>
@@ -674,7 +674,7 @@
     <w:semiHidden/>
     <w:unhideWhenUsed/>
     <w:qFormat/>
-    <w:rsid w:val="00E81389"/>
+    <w:rsid w:val="00F30A11"/>
     <w:pPr>
       <w:keepNext/>
       <w:keepLines/>
@@ -697,7 +697,7 @@
     <w:semiHidden/>
     <w:unhideWhenUsed/>
     <w:qFormat/>
-    <w:rsid w:val="00E81389"/>
+    <w:rsid w:val="00F30A11"/>
     <w:pPr>
       <w:keepNext/>
       <w:keepLines/>
@@ -720,7 +720,7 @@
     <w:semiHidden/>
     <w:unhideWhenUsed/>
     <w:qFormat/>
-    <w:rsid w:val="00E81389"/>
+    <w:rsid w:val="00F30A11"/>
     <w:pPr>
       <w:keepNext/>
       <w:keepLines/>
@@ -743,7 +743,7 @@
     <w:semiHidden/>
     <w:unhideWhenUsed/>
     <w:qFormat/>
-    <w:rsid w:val="00E81389"/>
+    <w:rsid w:val="00F30A11"/>
     <w:pPr>
       <w:keepNext/>
       <w:keepLines/>
@@ -764,7 +764,7 @@
     <w:semiHidden/>
     <w:unhideWhenUsed/>
     <w:qFormat/>
-    <w:rsid w:val="00E81389"/>
+    <w:rsid w:val="00F30A11"/>
     <w:pPr>
       <w:keepNext/>
       <w:keepLines/>
@@ -787,7 +787,7 @@
     <w:semiHidden/>
     <w:unhideWhenUsed/>
     <w:qFormat/>
-    <w:rsid w:val="00E81389"/>
+    <w:rsid w:val="00F30A11"/>
     <w:pPr>
       <w:keepNext/>
       <w:keepLines/>
@@ -808,7 +808,7 @@
     <w:semiHidden/>
     <w:unhideWhenUsed/>
     <w:qFormat/>
-    <w:rsid w:val="00E81389"/>
+    <w:rsid w:val="00F30A11"/>
     <w:pPr>
       <w:keepNext/>
       <w:keepLines/>
@@ -831,7 +831,7 @@
     <w:semiHidden/>
     <w:unhideWhenUsed/>
     <w:qFormat/>
-    <w:rsid w:val="00E81389"/>
+    <w:rsid w:val="00F30A11"/>
     <w:pPr>
       <w:keepNext/>
       <w:keepLines/>
@@ -875,7 +875,7 @@
     <w:basedOn w:val="DefaultParagraphFont"/>
     <w:link w:val="Heading1"/>
     <w:uiPriority w:val="9"/>
-    <w:rsid w:val="00E81389"/>
+    <w:rsid w:val="00F30A11"/>
     <w:rPr>
       <w:rFonts w:asciiTheme="majorHAnsi" w:eastAsiaTheme="majorEastAsia" w:hAnsiTheme="majorHAnsi" w:cstheme="majorBidi"/>
       <w:color w:val="0F4761" w:themeColor="accent1" w:themeShade="BF"/>
@@ -889,7 +889,7 @@
     <w:link w:val="Heading2"/>
     <w:uiPriority w:val="9"/>
     <w:semiHidden/>
-    <w:rsid w:val="00E81389"/>
+    <w:rsid w:val="00F30A11"/>
     <w:rPr>
       <w:rFonts w:asciiTheme="majorHAnsi" w:eastAsiaTheme="majorEastAsia" w:hAnsiTheme="majorHAnsi" w:cstheme="majorBidi"/>
       <w:color w:val="0F4761" w:themeColor="accent1" w:themeShade="BF"/>
@@ -903,7 +903,7 @@
     <w:link w:val="Heading3"/>
     <w:uiPriority w:val="9"/>
     <w:semiHidden/>
-    <w:rsid w:val="00E81389"/>
+    <w:rsid w:val="00F30A11"/>
     <w:rPr>
       <w:rFonts w:eastAsiaTheme="majorEastAsia" w:cstheme="majorBidi"/>
       <w:color w:val="0F4761" w:themeColor="accent1" w:themeShade="BF"/>
@@ -917,7 +917,7 @@
     <w:link w:val="Heading4"/>
     <w:uiPriority w:val="9"/>
     <w:semiHidden/>
-    <w:rsid w:val="00E81389"/>
+    <w:rsid w:val="00F30A11"/>
     <w:rPr>
       <w:rFonts w:eastAsiaTheme="majorEastAsia" w:cstheme="majorBidi"/>
       <w:i/>
@@ -931,7 +931,7 @@
     <w:link w:val="Heading5"/>
     <w:uiPriority w:val="9"/>
     <w:semiHidden/>
-    <w:rsid w:val="00E81389"/>
+    <w:rsid w:val="00F30A11"/>
     <w:rPr>
       <w:rFonts w:eastAsiaTheme="majorEastAsia" w:cstheme="majorBidi"/>
       <w:color w:val="0F4761" w:themeColor="accent1" w:themeShade="BF"/>
@@ -943,7 +943,7 @@
     <w:link w:val="Heading6"/>
     <w:uiPriority w:val="9"/>
     <w:semiHidden/>
-    <w:rsid w:val="00E81389"/>
+    <w:rsid w:val="00F30A11"/>
     <w:rPr>
       <w:rFonts w:eastAsiaTheme="majorEastAsia" w:cstheme="majorBidi"/>
       <w:i/>
@@ -957,7 +957,7 @@
     <w:link w:val="Heading7"/>
     <w:uiPriority w:val="9"/>
     <w:semiHidden/>
-    <w:rsid w:val="00E81389"/>
+    <w:rsid w:val="00F30A11"/>
     <w:rPr>
       <w:rFonts w:eastAsiaTheme="majorEastAsia" w:cstheme="majorBidi"/>
       <w:color w:val="595959" w:themeColor="text1" w:themeTint="A6"/>
@@ -969,7 +969,7 @@
     <w:link w:val="Heading8"/>
     <w:uiPriority w:val="9"/>
     <w:semiHidden/>
-    <w:rsid w:val="00E81389"/>
+    <w:rsid w:val="00F30A11"/>
     <w:rPr>
       <w:rFonts w:eastAsiaTheme="majorEastAsia" w:cstheme="majorBidi"/>
       <w:i/>
@@ -983,7 +983,7 @@
     <w:link w:val="Heading9"/>
     <w:uiPriority w:val="9"/>
     <w:semiHidden/>
-    <w:rsid w:val="00E81389"/>
+    <w:rsid w:val="00F30A11"/>
     <w:rPr>
       <w:rFonts w:eastAsiaTheme="majorEastAsia" w:cstheme="majorBidi"/>
       <w:color w:val="272727" w:themeColor="text1" w:themeTint="D8"/>
@@ -996,7 +996,7 @@
     <w:link w:val="TitleChar"/>
     <w:uiPriority w:val="10"/>
     <w:qFormat/>
-    <w:rsid w:val="00E81389"/>
+    <w:rsid w:val="00F30A11"/>
     <w:pPr>
       <w:spacing w:after="80" w:line="240" w:lineRule="auto"/>
       <w:contextualSpacing/>
@@ -1014,7 +1014,7 @@
     <w:basedOn w:val="DefaultParagraphFont"/>
     <w:link w:val="Title"/>
     <w:uiPriority w:val="10"/>
-    <w:rsid w:val="00E81389"/>
+    <w:rsid w:val="00F30A11"/>
     <w:rPr>
       <w:rFonts w:asciiTheme="majorHAnsi" w:eastAsiaTheme="majorEastAsia" w:hAnsiTheme="majorHAnsi" w:cstheme="majorBidi"/>
       <w:spacing w:val="-10"/>
@@ -1030,7 +1030,7 @@
     <w:link w:val="SubtitleChar"/>
     <w:uiPriority w:val="11"/>
     <w:qFormat/>
-    <w:rsid w:val="00E81389"/>
+    <w:rsid w:val="00F30A11"/>
     <w:pPr>
       <w:numPr>
         <w:ilvl w:val="1"/>
@@ -1049,7 +1049,7 @@
     <w:basedOn w:val="DefaultParagraphFont"/>
     <w:link w:val="Subtitle"/>
     <w:uiPriority w:val="11"/>
-    <w:rsid w:val="00E81389"/>
+    <w:rsid w:val="00F30A11"/>
     <w:rPr>
       <w:rFonts w:eastAsiaTheme="majorEastAsia" w:cstheme="majorBidi"/>
       <w:color w:val="595959" w:themeColor="text1" w:themeTint="A6"/>
@@ -1065,7 +1065,7 @@
     <w:link w:val="QuoteChar"/>
     <w:uiPriority w:val="29"/>
     <w:qFormat/>
-    <w:rsid w:val="00E81389"/>
+    <w:rsid w:val="00F30A11"/>
     <w:pPr>
       <w:spacing w:before="160"/>
       <w:jc w:val="center"/>
@@ -1081,7 +1081,7 @@
     <w:basedOn w:val="DefaultParagraphFont"/>
     <w:link w:val="Quote"/>
     <w:uiPriority w:val="29"/>
-    <w:rsid w:val="00E81389"/>
+    <w:rsid w:val="00F30A11"/>
     <w:rPr>
       <w:i/>
       <w:iCs/>
@@ -1093,7 +1093,7 @@
     <w:basedOn w:val="Normal"/>
     <w:uiPriority w:val="34"/>
     <w:qFormat/>
-    <w:rsid w:val="00E81389"/>
+    <w:rsid w:val="00F30A11"/>
     <w:pPr>
       <w:ind w:left="720"/>
       <w:contextualSpacing/>
@@ -1104,7 +1104,7 @@
     <w:basedOn w:val="DefaultParagraphFont"/>
     <w:uiPriority w:val="21"/>
     <w:qFormat/>
-    <w:rsid w:val="00E81389"/>
+    <w:rsid w:val="00F30A11"/>
     <w:rPr>
       <w:i/>
       <w:iCs/>
@@ -1118,7 +1118,7 @@
     <w:link w:val="IntenseQuoteChar"/>
     <w:uiPriority w:val="30"/>
     <w:qFormat/>
-    <w:rsid w:val="00E81389"/>
+    <w:rsid w:val="00F30A11"/>
     <w:pPr>
       <w:pBdr>
         <w:top w:val="single" w:sz="4" w:space="10" w:color="0F4761" w:themeColor="accent1" w:themeShade="BF"/>
@@ -1139,7 +1139,7 @@
     <w:basedOn w:val="DefaultParagraphFont"/>
     <w:link w:val="IntenseQuote"/>
     <w:uiPriority w:val="30"/>
-    <w:rsid w:val="00E81389"/>
+    <w:rsid w:val="00F30A11"/>
     <w:rPr>
       <w:i/>
       <w:iCs/>
@@ -1151,7 +1151,7 @@
     <w:basedOn w:val="DefaultParagraphFont"/>
     <w:uiPriority w:val="32"/>
     <w:qFormat/>
-    <w:rsid w:val="00E81389"/>
+    <w:rsid w:val="00F30A11"/>
     <w:rPr>
       <w:b/>
       <w:bCs/>
@@ -1166,7 +1166,7 @@
     <w:link w:val="HeaderChar"/>
     <w:uiPriority w:val="99"/>
     <w:unhideWhenUsed/>
-    <w:rsid w:val="00E81389"/>
+    <w:rsid w:val="00F30A11"/>
     <w:pPr>
       <w:tabs>
         <w:tab w:val="center" w:pos="4680"/>
@@ -1180,7 +1180,7 @@
     <w:basedOn w:val="DefaultParagraphFont"/>
     <w:link w:val="Header"/>
     <w:uiPriority w:val="99"/>
-    <w:rsid w:val="00E81389"/>
+    <w:rsid w:val="00F30A11"/>
   </w:style>
   <w:style w:type="paragraph" w:styleId="Footer">
     <w:name w:val="footer"/>
@@ -1188,7 +1188,7 @@
     <w:link w:val="FooterChar"/>
     <w:uiPriority w:val="99"/>
     <w:unhideWhenUsed/>
-    <w:rsid w:val="00E81389"/>
+    <w:rsid w:val="00F30A11"/>
     <w:pPr>
       <w:tabs>
         <w:tab w:val="center" w:pos="4680"/>
@@ -1202,7 +1202,7 @@
     <w:basedOn w:val="DefaultParagraphFont"/>
     <w:link w:val="Footer"/>
     <w:uiPriority w:val="99"/>
-    <w:rsid w:val="00E81389"/>
+    <w:rsid w:val="00F30A11"/>
   </w:style>
 </w:styles>
 </file>

</xml_diff>

<commit_message>
Recap Fill: four blanks out of the box, draft date added, and a step-by-step guide
Fields now ships with period, amount, draft and due, the four things that
change on an EFT each month. The sample EFT recap.docx has all four. The
README is rewritten as plain steps: set up a state once, then each month,
how to add a blank later, and what each box message means.
</commit_message>
<xml_diff>
--- a/General/Recap fill/EFT recap.docx
+++ b/General/Recap fill/EFT recap.docx
@@ -19,7 +19,7 @@
     </w:p>
     <w:p>
       <w:r>
-        <w:t>Please key this payment by [[due]].</w:t>
+        <w:t>Draft this payment on [[draft]]. It is due [[due]].</w:t>
       </w:r>
     </w:p>
     <w:tbl>
@@ -651,7 +651,7 @@
     <w:link w:val="Heading1Char"/>
     <w:uiPriority w:val="9"/>
     <w:qFormat/>
-    <w:rsid w:val="00F30A11"/>
+    <w:rsid w:val="00D8228C"/>
     <w:pPr>
       <w:keepNext/>
       <w:keepLines/>
@@ -674,7 +674,7 @@
     <w:semiHidden/>
     <w:unhideWhenUsed/>
     <w:qFormat/>
-    <w:rsid w:val="00F30A11"/>
+    <w:rsid w:val="00D8228C"/>
     <w:pPr>
       <w:keepNext/>
       <w:keepLines/>
@@ -697,7 +697,7 @@
     <w:semiHidden/>
     <w:unhideWhenUsed/>
     <w:qFormat/>
-    <w:rsid w:val="00F30A11"/>
+    <w:rsid w:val="00D8228C"/>
     <w:pPr>
       <w:keepNext/>
       <w:keepLines/>
@@ -720,7 +720,7 @@
     <w:semiHidden/>
     <w:unhideWhenUsed/>
     <w:qFormat/>
-    <w:rsid w:val="00F30A11"/>
+    <w:rsid w:val="00D8228C"/>
     <w:pPr>
       <w:keepNext/>
       <w:keepLines/>
@@ -743,7 +743,7 @@
     <w:semiHidden/>
     <w:unhideWhenUsed/>
     <w:qFormat/>
-    <w:rsid w:val="00F30A11"/>
+    <w:rsid w:val="00D8228C"/>
     <w:pPr>
       <w:keepNext/>
       <w:keepLines/>
@@ -764,7 +764,7 @@
     <w:semiHidden/>
     <w:unhideWhenUsed/>
     <w:qFormat/>
-    <w:rsid w:val="00F30A11"/>
+    <w:rsid w:val="00D8228C"/>
     <w:pPr>
       <w:keepNext/>
       <w:keepLines/>
@@ -787,7 +787,7 @@
     <w:semiHidden/>
     <w:unhideWhenUsed/>
     <w:qFormat/>
-    <w:rsid w:val="00F30A11"/>
+    <w:rsid w:val="00D8228C"/>
     <w:pPr>
       <w:keepNext/>
       <w:keepLines/>
@@ -808,7 +808,7 @@
     <w:semiHidden/>
     <w:unhideWhenUsed/>
     <w:qFormat/>
-    <w:rsid w:val="00F30A11"/>
+    <w:rsid w:val="00D8228C"/>
     <w:pPr>
       <w:keepNext/>
       <w:keepLines/>
@@ -831,7 +831,7 @@
     <w:semiHidden/>
     <w:unhideWhenUsed/>
     <w:qFormat/>
-    <w:rsid w:val="00F30A11"/>
+    <w:rsid w:val="00D8228C"/>
     <w:pPr>
       <w:keepNext/>
       <w:keepLines/>
@@ -875,7 +875,7 @@
     <w:basedOn w:val="DefaultParagraphFont"/>
     <w:link w:val="Heading1"/>
     <w:uiPriority w:val="9"/>
-    <w:rsid w:val="00F30A11"/>
+    <w:rsid w:val="00D8228C"/>
     <w:rPr>
       <w:rFonts w:asciiTheme="majorHAnsi" w:eastAsiaTheme="majorEastAsia" w:hAnsiTheme="majorHAnsi" w:cstheme="majorBidi"/>
       <w:color w:val="0F4761" w:themeColor="accent1" w:themeShade="BF"/>
@@ -889,7 +889,7 @@
     <w:link w:val="Heading2"/>
     <w:uiPriority w:val="9"/>
     <w:semiHidden/>
-    <w:rsid w:val="00F30A11"/>
+    <w:rsid w:val="00D8228C"/>
     <w:rPr>
       <w:rFonts w:asciiTheme="majorHAnsi" w:eastAsiaTheme="majorEastAsia" w:hAnsiTheme="majorHAnsi" w:cstheme="majorBidi"/>
       <w:color w:val="0F4761" w:themeColor="accent1" w:themeShade="BF"/>
@@ -903,7 +903,7 @@
     <w:link w:val="Heading3"/>
     <w:uiPriority w:val="9"/>
     <w:semiHidden/>
-    <w:rsid w:val="00F30A11"/>
+    <w:rsid w:val="00D8228C"/>
     <w:rPr>
       <w:rFonts w:eastAsiaTheme="majorEastAsia" w:cstheme="majorBidi"/>
       <w:color w:val="0F4761" w:themeColor="accent1" w:themeShade="BF"/>
@@ -917,7 +917,7 @@
     <w:link w:val="Heading4"/>
     <w:uiPriority w:val="9"/>
     <w:semiHidden/>
-    <w:rsid w:val="00F30A11"/>
+    <w:rsid w:val="00D8228C"/>
     <w:rPr>
       <w:rFonts w:eastAsiaTheme="majorEastAsia" w:cstheme="majorBidi"/>
       <w:i/>
@@ -931,7 +931,7 @@
     <w:link w:val="Heading5"/>
     <w:uiPriority w:val="9"/>
     <w:semiHidden/>
-    <w:rsid w:val="00F30A11"/>
+    <w:rsid w:val="00D8228C"/>
     <w:rPr>
       <w:rFonts w:eastAsiaTheme="majorEastAsia" w:cstheme="majorBidi"/>
       <w:color w:val="0F4761" w:themeColor="accent1" w:themeShade="BF"/>
@@ -943,7 +943,7 @@
     <w:link w:val="Heading6"/>
     <w:uiPriority w:val="9"/>
     <w:semiHidden/>
-    <w:rsid w:val="00F30A11"/>
+    <w:rsid w:val="00D8228C"/>
     <w:rPr>
       <w:rFonts w:eastAsiaTheme="majorEastAsia" w:cstheme="majorBidi"/>
       <w:i/>
@@ -957,7 +957,7 @@
     <w:link w:val="Heading7"/>
     <w:uiPriority w:val="9"/>
     <w:semiHidden/>
-    <w:rsid w:val="00F30A11"/>
+    <w:rsid w:val="00D8228C"/>
     <w:rPr>
       <w:rFonts w:eastAsiaTheme="majorEastAsia" w:cstheme="majorBidi"/>
       <w:color w:val="595959" w:themeColor="text1" w:themeTint="A6"/>
@@ -969,7 +969,7 @@
     <w:link w:val="Heading8"/>
     <w:uiPriority w:val="9"/>
     <w:semiHidden/>
-    <w:rsid w:val="00F30A11"/>
+    <w:rsid w:val="00D8228C"/>
     <w:rPr>
       <w:rFonts w:eastAsiaTheme="majorEastAsia" w:cstheme="majorBidi"/>
       <w:i/>
@@ -983,7 +983,7 @@
     <w:link w:val="Heading9"/>
     <w:uiPriority w:val="9"/>
     <w:semiHidden/>
-    <w:rsid w:val="00F30A11"/>
+    <w:rsid w:val="00D8228C"/>
     <w:rPr>
       <w:rFonts w:eastAsiaTheme="majorEastAsia" w:cstheme="majorBidi"/>
       <w:color w:val="272727" w:themeColor="text1" w:themeTint="D8"/>
@@ -996,7 +996,7 @@
     <w:link w:val="TitleChar"/>
     <w:uiPriority w:val="10"/>
     <w:qFormat/>
-    <w:rsid w:val="00F30A11"/>
+    <w:rsid w:val="00D8228C"/>
     <w:pPr>
       <w:spacing w:after="80" w:line="240" w:lineRule="auto"/>
       <w:contextualSpacing/>
@@ -1014,7 +1014,7 @@
     <w:basedOn w:val="DefaultParagraphFont"/>
     <w:link w:val="Title"/>
     <w:uiPriority w:val="10"/>
-    <w:rsid w:val="00F30A11"/>
+    <w:rsid w:val="00D8228C"/>
     <w:rPr>
       <w:rFonts w:asciiTheme="majorHAnsi" w:eastAsiaTheme="majorEastAsia" w:hAnsiTheme="majorHAnsi" w:cstheme="majorBidi"/>
       <w:spacing w:val="-10"/>
@@ -1030,7 +1030,7 @@
     <w:link w:val="SubtitleChar"/>
     <w:uiPriority w:val="11"/>
     <w:qFormat/>
-    <w:rsid w:val="00F30A11"/>
+    <w:rsid w:val="00D8228C"/>
     <w:pPr>
       <w:numPr>
         <w:ilvl w:val="1"/>
@@ -1049,7 +1049,7 @@
     <w:basedOn w:val="DefaultParagraphFont"/>
     <w:link w:val="Subtitle"/>
     <w:uiPriority w:val="11"/>
-    <w:rsid w:val="00F30A11"/>
+    <w:rsid w:val="00D8228C"/>
     <w:rPr>
       <w:rFonts w:eastAsiaTheme="majorEastAsia" w:cstheme="majorBidi"/>
       <w:color w:val="595959" w:themeColor="text1" w:themeTint="A6"/>
@@ -1065,7 +1065,7 @@
     <w:link w:val="QuoteChar"/>
     <w:uiPriority w:val="29"/>
     <w:qFormat/>
-    <w:rsid w:val="00F30A11"/>
+    <w:rsid w:val="00D8228C"/>
     <w:pPr>
       <w:spacing w:before="160"/>
       <w:jc w:val="center"/>
@@ -1081,7 +1081,7 @@
     <w:basedOn w:val="DefaultParagraphFont"/>
     <w:link w:val="Quote"/>
     <w:uiPriority w:val="29"/>
-    <w:rsid w:val="00F30A11"/>
+    <w:rsid w:val="00D8228C"/>
     <w:rPr>
       <w:i/>
       <w:iCs/>
@@ -1093,7 +1093,7 @@
     <w:basedOn w:val="Normal"/>
     <w:uiPriority w:val="34"/>
     <w:qFormat/>
-    <w:rsid w:val="00F30A11"/>
+    <w:rsid w:val="00D8228C"/>
     <w:pPr>
       <w:ind w:left="720"/>
       <w:contextualSpacing/>
@@ -1104,7 +1104,7 @@
     <w:basedOn w:val="DefaultParagraphFont"/>
     <w:uiPriority w:val="21"/>
     <w:qFormat/>
-    <w:rsid w:val="00F30A11"/>
+    <w:rsid w:val="00D8228C"/>
     <w:rPr>
       <w:i/>
       <w:iCs/>
@@ -1118,7 +1118,7 @@
     <w:link w:val="IntenseQuoteChar"/>
     <w:uiPriority w:val="30"/>
     <w:qFormat/>
-    <w:rsid w:val="00F30A11"/>
+    <w:rsid w:val="00D8228C"/>
     <w:pPr>
       <w:pBdr>
         <w:top w:val="single" w:sz="4" w:space="10" w:color="0F4761" w:themeColor="accent1" w:themeShade="BF"/>
@@ -1139,7 +1139,7 @@
     <w:basedOn w:val="DefaultParagraphFont"/>
     <w:link w:val="IntenseQuote"/>
     <w:uiPriority w:val="30"/>
-    <w:rsid w:val="00F30A11"/>
+    <w:rsid w:val="00D8228C"/>
     <w:rPr>
       <w:i/>
       <w:iCs/>
@@ -1151,7 +1151,7 @@
     <w:basedOn w:val="DefaultParagraphFont"/>
     <w:uiPriority w:val="32"/>
     <w:qFormat/>
-    <w:rsid w:val="00F30A11"/>
+    <w:rsid w:val="00D8228C"/>
     <w:rPr>
       <w:b/>
       <w:bCs/>
@@ -1166,7 +1166,7 @@
     <w:link w:val="HeaderChar"/>
     <w:uiPriority w:val="99"/>
     <w:unhideWhenUsed/>
-    <w:rsid w:val="00F30A11"/>
+    <w:rsid w:val="00D8228C"/>
     <w:pPr>
       <w:tabs>
         <w:tab w:val="center" w:pos="4680"/>
@@ -1180,7 +1180,7 @@
     <w:basedOn w:val="DefaultParagraphFont"/>
     <w:link w:val="Header"/>
     <w:uiPriority w:val="99"/>
-    <w:rsid w:val="00F30A11"/>
+    <w:rsid w:val="00D8228C"/>
   </w:style>
   <w:style w:type="paragraph" w:styleId="Footer">
     <w:name w:val="footer"/>
@@ -1188,7 +1188,7 @@
     <w:link w:val="FooterChar"/>
     <w:uiPriority w:val="99"/>
     <w:unhideWhenUsed/>
-    <w:rsid w:val="00F30A11"/>
+    <w:rsid w:val="00D8228C"/>
     <w:pPr>
       <w:tabs>
         <w:tab w:val="center" w:pos="4680"/>
@@ -1202,7 +1202,7 @@
     <w:basedOn w:val="DefaultParagraphFont"/>
     <w:link w:val="Footer"/>
     <w:uiPriority w:val="99"/>
-    <w:rsid w:val="00F30A11"/>
+    <w:rsid w:val="00D8228C"/>
   </w:style>
 </w:styles>
 </file>

</xml_diff>

<commit_message>
Recap Fill: the guide after the second read
Says the master must be a .docx or .doc whose name doesn't end in a date,
that tags work in headers, footers, tables and text boxes, to paste values
only, how to change a value's look, to redo a copy after a warning, how to
give a fifth row a date or dollar look, and what the "On Fields twice" and
"Fill stopped" boxes mean. The macro's comment now says four tags; the
workbook is rebuilt from it, 132 checks, 0 failures.
</commit_message>
<xml_diff>
--- a/General/Recap fill/EFT recap.docx
+++ b/General/Recap fill/EFT recap.docx
@@ -651,7 +651,7 @@
     <w:link w:val="Heading1Char"/>
     <w:uiPriority w:val="9"/>
     <w:qFormat/>
-    <w:rsid w:val="00D8228C"/>
+    <w:rsid w:val="0084518A"/>
     <w:pPr>
       <w:keepNext/>
       <w:keepLines/>
@@ -674,7 +674,7 @@
     <w:semiHidden/>
     <w:unhideWhenUsed/>
     <w:qFormat/>
-    <w:rsid w:val="00D8228C"/>
+    <w:rsid w:val="0084518A"/>
     <w:pPr>
       <w:keepNext/>
       <w:keepLines/>
@@ -697,7 +697,7 @@
     <w:semiHidden/>
     <w:unhideWhenUsed/>
     <w:qFormat/>
-    <w:rsid w:val="00D8228C"/>
+    <w:rsid w:val="0084518A"/>
     <w:pPr>
       <w:keepNext/>
       <w:keepLines/>
@@ -720,7 +720,7 @@
     <w:semiHidden/>
     <w:unhideWhenUsed/>
     <w:qFormat/>
-    <w:rsid w:val="00D8228C"/>
+    <w:rsid w:val="0084518A"/>
     <w:pPr>
       <w:keepNext/>
       <w:keepLines/>
@@ -743,7 +743,7 @@
     <w:semiHidden/>
     <w:unhideWhenUsed/>
     <w:qFormat/>
-    <w:rsid w:val="00D8228C"/>
+    <w:rsid w:val="0084518A"/>
     <w:pPr>
       <w:keepNext/>
       <w:keepLines/>
@@ -764,7 +764,7 @@
     <w:semiHidden/>
     <w:unhideWhenUsed/>
     <w:qFormat/>
-    <w:rsid w:val="00D8228C"/>
+    <w:rsid w:val="0084518A"/>
     <w:pPr>
       <w:keepNext/>
       <w:keepLines/>
@@ -787,7 +787,7 @@
     <w:semiHidden/>
     <w:unhideWhenUsed/>
     <w:qFormat/>
-    <w:rsid w:val="00D8228C"/>
+    <w:rsid w:val="0084518A"/>
     <w:pPr>
       <w:keepNext/>
       <w:keepLines/>
@@ -808,7 +808,7 @@
     <w:semiHidden/>
     <w:unhideWhenUsed/>
     <w:qFormat/>
-    <w:rsid w:val="00D8228C"/>
+    <w:rsid w:val="0084518A"/>
     <w:pPr>
       <w:keepNext/>
       <w:keepLines/>
@@ -831,7 +831,7 @@
     <w:semiHidden/>
     <w:unhideWhenUsed/>
     <w:qFormat/>
-    <w:rsid w:val="00D8228C"/>
+    <w:rsid w:val="0084518A"/>
     <w:pPr>
       <w:keepNext/>
       <w:keepLines/>
@@ -875,7 +875,7 @@
     <w:basedOn w:val="DefaultParagraphFont"/>
     <w:link w:val="Heading1"/>
     <w:uiPriority w:val="9"/>
-    <w:rsid w:val="00D8228C"/>
+    <w:rsid w:val="0084518A"/>
     <w:rPr>
       <w:rFonts w:asciiTheme="majorHAnsi" w:eastAsiaTheme="majorEastAsia" w:hAnsiTheme="majorHAnsi" w:cstheme="majorBidi"/>
       <w:color w:val="0F4761" w:themeColor="accent1" w:themeShade="BF"/>
@@ -889,7 +889,7 @@
     <w:link w:val="Heading2"/>
     <w:uiPriority w:val="9"/>
     <w:semiHidden/>
-    <w:rsid w:val="00D8228C"/>
+    <w:rsid w:val="0084518A"/>
     <w:rPr>
       <w:rFonts w:asciiTheme="majorHAnsi" w:eastAsiaTheme="majorEastAsia" w:hAnsiTheme="majorHAnsi" w:cstheme="majorBidi"/>
       <w:color w:val="0F4761" w:themeColor="accent1" w:themeShade="BF"/>
@@ -903,7 +903,7 @@
     <w:link w:val="Heading3"/>
     <w:uiPriority w:val="9"/>
     <w:semiHidden/>
-    <w:rsid w:val="00D8228C"/>
+    <w:rsid w:val="0084518A"/>
     <w:rPr>
       <w:rFonts w:eastAsiaTheme="majorEastAsia" w:cstheme="majorBidi"/>
       <w:color w:val="0F4761" w:themeColor="accent1" w:themeShade="BF"/>
@@ -917,7 +917,7 @@
     <w:link w:val="Heading4"/>
     <w:uiPriority w:val="9"/>
     <w:semiHidden/>
-    <w:rsid w:val="00D8228C"/>
+    <w:rsid w:val="0084518A"/>
     <w:rPr>
       <w:rFonts w:eastAsiaTheme="majorEastAsia" w:cstheme="majorBidi"/>
       <w:i/>
@@ -931,7 +931,7 @@
     <w:link w:val="Heading5"/>
     <w:uiPriority w:val="9"/>
     <w:semiHidden/>
-    <w:rsid w:val="00D8228C"/>
+    <w:rsid w:val="0084518A"/>
     <w:rPr>
       <w:rFonts w:eastAsiaTheme="majorEastAsia" w:cstheme="majorBidi"/>
       <w:color w:val="0F4761" w:themeColor="accent1" w:themeShade="BF"/>
@@ -943,7 +943,7 @@
     <w:link w:val="Heading6"/>
     <w:uiPriority w:val="9"/>
     <w:semiHidden/>
-    <w:rsid w:val="00D8228C"/>
+    <w:rsid w:val="0084518A"/>
     <w:rPr>
       <w:rFonts w:eastAsiaTheme="majorEastAsia" w:cstheme="majorBidi"/>
       <w:i/>
@@ -957,7 +957,7 @@
     <w:link w:val="Heading7"/>
     <w:uiPriority w:val="9"/>
     <w:semiHidden/>
-    <w:rsid w:val="00D8228C"/>
+    <w:rsid w:val="0084518A"/>
     <w:rPr>
       <w:rFonts w:eastAsiaTheme="majorEastAsia" w:cstheme="majorBidi"/>
       <w:color w:val="595959" w:themeColor="text1" w:themeTint="A6"/>
@@ -969,7 +969,7 @@
     <w:link w:val="Heading8"/>
     <w:uiPriority w:val="9"/>
     <w:semiHidden/>
-    <w:rsid w:val="00D8228C"/>
+    <w:rsid w:val="0084518A"/>
     <w:rPr>
       <w:rFonts w:eastAsiaTheme="majorEastAsia" w:cstheme="majorBidi"/>
       <w:i/>
@@ -983,7 +983,7 @@
     <w:link w:val="Heading9"/>
     <w:uiPriority w:val="9"/>
     <w:semiHidden/>
-    <w:rsid w:val="00D8228C"/>
+    <w:rsid w:val="0084518A"/>
     <w:rPr>
       <w:rFonts w:eastAsiaTheme="majorEastAsia" w:cstheme="majorBidi"/>
       <w:color w:val="272727" w:themeColor="text1" w:themeTint="D8"/>
@@ -996,7 +996,7 @@
     <w:link w:val="TitleChar"/>
     <w:uiPriority w:val="10"/>
     <w:qFormat/>
-    <w:rsid w:val="00D8228C"/>
+    <w:rsid w:val="0084518A"/>
     <w:pPr>
       <w:spacing w:after="80" w:line="240" w:lineRule="auto"/>
       <w:contextualSpacing/>
@@ -1014,7 +1014,7 @@
     <w:basedOn w:val="DefaultParagraphFont"/>
     <w:link w:val="Title"/>
     <w:uiPriority w:val="10"/>
-    <w:rsid w:val="00D8228C"/>
+    <w:rsid w:val="0084518A"/>
     <w:rPr>
       <w:rFonts w:asciiTheme="majorHAnsi" w:eastAsiaTheme="majorEastAsia" w:hAnsiTheme="majorHAnsi" w:cstheme="majorBidi"/>
       <w:spacing w:val="-10"/>
@@ -1030,7 +1030,7 @@
     <w:link w:val="SubtitleChar"/>
     <w:uiPriority w:val="11"/>
     <w:qFormat/>
-    <w:rsid w:val="00D8228C"/>
+    <w:rsid w:val="0084518A"/>
     <w:pPr>
       <w:numPr>
         <w:ilvl w:val="1"/>
@@ -1049,7 +1049,7 @@
     <w:basedOn w:val="DefaultParagraphFont"/>
     <w:link w:val="Subtitle"/>
     <w:uiPriority w:val="11"/>
-    <w:rsid w:val="00D8228C"/>
+    <w:rsid w:val="0084518A"/>
     <w:rPr>
       <w:rFonts w:eastAsiaTheme="majorEastAsia" w:cstheme="majorBidi"/>
       <w:color w:val="595959" w:themeColor="text1" w:themeTint="A6"/>
@@ -1065,7 +1065,7 @@
     <w:link w:val="QuoteChar"/>
     <w:uiPriority w:val="29"/>
     <w:qFormat/>
-    <w:rsid w:val="00D8228C"/>
+    <w:rsid w:val="0084518A"/>
     <w:pPr>
       <w:spacing w:before="160"/>
       <w:jc w:val="center"/>
@@ -1081,7 +1081,7 @@
     <w:basedOn w:val="DefaultParagraphFont"/>
     <w:link w:val="Quote"/>
     <w:uiPriority w:val="29"/>
-    <w:rsid w:val="00D8228C"/>
+    <w:rsid w:val="0084518A"/>
     <w:rPr>
       <w:i/>
       <w:iCs/>
@@ -1093,7 +1093,7 @@
     <w:basedOn w:val="Normal"/>
     <w:uiPriority w:val="34"/>
     <w:qFormat/>
-    <w:rsid w:val="00D8228C"/>
+    <w:rsid w:val="0084518A"/>
     <w:pPr>
       <w:ind w:left="720"/>
       <w:contextualSpacing/>
@@ -1104,7 +1104,7 @@
     <w:basedOn w:val="DefaultParagraphFont"/>
     <w:uiPriority w:val="21"/>
     <w:qFormat/>
-    <w:rsid w:val="00D8228C"/>
+    <w:rsid w:val="0084518A"/>
     <w:rPr>
       <w:i/>
       <w:iCs/>
@@ -1118,7 +1118,7 @@
     <w:link w:val="IntenseQuoteChar"/>
     <w:uiPriority w:val="30"/>
     <w:qFormat/>
-    <w:rsid w:val="00D8228C"/>
+    <w:rsid w:val="0084518A"/>
     <w:pPr>
       <w:pBdr>
         <w:top w:val="single" w:sz="4" w:space="10" w:color="0F4761" w:themeColor="accent1" w:themeShade="BF"/>
@@ -1139,7 +1139,7 @@
     <w:basedOn w:val="DefaultParagraphFont"/>
     <w:link w:val="IntenseQuote"/>
     <w:uiPriority w:val="30"/>
-    <w:rsid w:val="00D8228C"/>
+    <w:rsid w:val="0084518A"/>
     <w:rPr>
       <w:i/>
       <w:iCs/>
@@ -1151,7 +1151,7 @@
     <w:basedOn w:val="DefaultParagraphFont"/>
     <w:uiPriority w:val="32"/>
     <w:qFormat/>
-    <w:rsid w:val="00D8228C"/>
+    <w:rsid w:val="0084518A"/>
     <w:rPr>
       <w:b/>
       <w:bCs/>
@@ -1166,7 +1166,7 @@
     <w:link w:val="HeaderChar"/>
     <w:uiPriority w:val="99"/>
     <w:unhideWhenUsed/>
-    <w:rsid w:val="00D8228C"/>
+    <w:rsid w:val="0084518A"/>
     <w:pPr>
       <w:tabs>
         <w:tab w:val="center" w:pos="4680"/>
@@ -1180,7 +1180,7 @@
     <w:basedOn w:val="DefaultParagraphFont"/>
     <w:link w:val="Header"/>
     <w:uiPriority w:val="99"/>
-    <w:rsid w:val="00D8228C"/>
+    <w:rsid w:val="0084518A"/>
   </w:style>
   <w:style w:type="paragraph" w:styleId="Footer">
     <w:name w:val="footer"/>
@@ -1188,7 +1188,7 @@
     <w:link w:val="FooterChar"/>
     <w:uiPriority w:val="99"/>
     <w:unhideWhenUsed/>
-    <w:rsid w:val="00D8228C"/>
+    <w:rsid w:val="0084518A"/>
     <w:pPr>
       <w:tabs>
         <w:tab w:val="center" w:pos="4680"/>
@@ -1202,7 +1202,7 @@
     <w:basedOn w:val="DefaultParagraphFont"/>
     <w:link w:val="Footer"/>
     <w:uiPriority w:val="99"/>
-    <w:rsid w:val="00D8228C"/>
+    <w:rsid w:val="0084518A"/>
   </w:style>
 </w:styles>
 </file>

</xml_diff>